<commit_message>
Bản 9.72: Sửa thiếu bước "npm run build" cho api-admin ở hướng dẫn 9.59-9.68
Lỗi thật người dùng gặp: trang "Cấu hình Voucher" vẫn hiện giao diện cũ
và báo lỗi "Phản hồi không phải JSON" sau khi làm theo hướng dẫn Phần 1
(thêm máy chủ DSMART "Fuji") — vì hướng dẫn chỉ ghi "khởi động lại
api-server và api-admin", thiếu bước build frontend api-admin (SPA, cần
npm run build để áp dụng code frontend mới, restart không đủ). Bổ sung
bước này ở cả Phần 1 và Phần 2 (cả 2 đều đổi file frontend api-admin).

Co-Authored-By: Claude Sonnet 5 <noreply@anthropic.com>
Claude-Session: https://claude.ai/code/session_01WvHaS6vit72jCXT99DeVuU
</commit_message>
<xml_diff>
--- a/deploy/Hướng dẫn triển khai gộp — bản 9.59 đến 9.68.docx
+++ b/deploy/Hướng dẫn triển khai gộp — bản 9.59 đến 9.68.docx
@@ -1357,7 +1357,132 @@
         <w:pStyle w:val="Compact"/>
       </w:pPr>
       <w:r>
-        <w:t xml:space="preserve">Khởi động lại</w:t>
+        <w:rPr>
+          <w:rStyle w:val="VerbatimChar"/>
+          <w:bCs/>
+          <w:b/>
+        </w:rPr>
+        <w:t xml:space="preserve">cd api-admin &amp;&amp; npm run build</w:t>
+      </w:r>
+      <w:r>
+        <w:t xml:space="preserve"> </w:t>
+      </w:r>
+      <w:r>
+        <w:t xml:space="preserve">(BẮT BUỘC — bản 9.59 đổi hẳn trang</w:t>
+      </w:r>
+      <w:r>
+        <w:t xml:space="preserve"> </w:t>
+      </w:r>
+      <w:r>
+        <w:t xml:space="preserve">“</w:t>
+      </w:r>
+      <w:r>
+        <w:t xml:space="preserve">Cấu hình Voucher</w:t>
+      </w:r>
+      <w:r>
+        <w:t xml:space="preserve">”</w:t>
+      </w:r>
+      <w:r>
+        <w:t xml:space="preserve"> </w:t>
+      </w:r>
+      <w:r>
+        <w:t xml:space="preserve">sang danh sách nhiều dòng,</w:t>
+      </w:r>
+      <w:r>
+        <w:t xml:space="preserve"> </w:t>
+      </w:r>
+      <w:r>
+        <w:rPr>
+          <w:rStyle w:val="VerbatimChar"/>
+        </w:rPr>
+        <w:t xml:space="preserve">VoucherSettingsPage.jsx</w:t>
+      </w:r>
+      <w:r>
+        <w:t xml:space="preserve"> </w:t>
+      </w:r>
+      <w:r>
+        <w:t xml:space="preserve">là file FRONTEND, chỉ restart tiến trình phục vụ</w:t>
+      </w:r>
+      <w:r>
+        <w:t xml:space="preserve"> </w:t>
+      </w:r>
+      <w:r>
+        <w:rPr>
+          <w:rStyle w:val="VerbatimChar"/>
+        </w:rPr>
+        <w:t xml:space="preserve">dist/</w:t>
+      </w:r>
+      <w:r>
+        <w:t xml:space="preserve"> </w:t>
+      </w:r>
+      <w:r>
+        <w:t xml:space="preserve">cũ KHÔNG đủ,</w:t>
+      </w:r>
+      <w:r>
+        <w:t xml:space="preserve"> </w:t>
+      </w:r>
+      <w:r>
+        <w:t xml:space="preserve">vẫn thấy giao diện 1 dòng/1 dropdown CŨ và bấm</w:t>
+      </w:r>
+      <w:r>
+        <w:t xml:space="preserve"> </w:t>
+      </w:r>
+      <w:r>
+        <w:t xml:space="preserve">“</w:t>
+      </w:r>
+      <w:r>
+        <w:t xml:space="preserve">Lưu</w:t>
+      </w:r>
+      <w:r>
+        <w:t xml:space="preserve">”</w:t>
+      </w:r>
+      <w:r>
+        <w:t xml:space="preserve"> </w:t>
+      </w:r>
+      <w:r>
+        <w:t xml:space="preserve">báo lỗi</w:t>
+      </w:r>
+      <w:r>
+        <w:t xml:space="preserve"> </w:t>
+      </w:r>
+      <w:r>
+        <w:t xml:space="preserve">“</w:t>
+      </w:r>
+      <w:r>
+        <w:t xml:space="preserve">Phản hồi</w:t>
+      </w:r>
+      <w:r>
+        <w:t xml:space="preserve"> </w:t>
+      </w:r>
+      <w:r>
+        <w:t xml:space="preserve">không phải JSON</w:t>
+      </w:r>
+      <w:r>
+        <w:t xml:space="preserve">”</w:t>
+      </w:r>
+      <w:r>
+        <w:t xml:space="preserve"> </w:t>
+      </w:r>
+      <w:r>
+        <w:t xml:space="preserve">— lỗi THẬT đã gặp, xem bản 9.72 ở</w:t>
+      </w:r>
+      <w:r>
+        <w:t xml:space="preserve"> </w:t>
+      </w:r>
+      <w:r>
+        <w:rPr>
+          <w:rStyle w:val="VerbatimChar"/>
+        </w:rPr>
+        <w:t xml:space="preserve">VERSION.md</w:t>
+      </w:r>
+      <w:r>
+        <w:t xml:space="preserve">), rồi</w:t>
+      </w:r>
+      <w:r>
+        <w:t xml:space="preserve"> </w:t>
+      </w:r>
+      <w:r>
+        <w:t xml:space="preserve">khởi động lại</w:t>
       </w:r>
       <w:r>
         <w:t xml:space="preserve"> </w:t>
@@ -2642,7 +2767,36 @@
         </w:numPr>
       </w:pPr>
       <w:r>
-        <w:t xml:space="preserve">Khởi động lại</w:t>
+        <w:rPr>
+          <w:rStyle w:val="VerbatimChar"/>
+          <w:bCs/>
+          <w:b/>
+        </w:rPr>
+        <w:t xml:space="preserve">cd api-admin &amp;&amp; npm run build</w:t>
+      </w:r>
+      <w:r>
+        <w:t xml:space="preserve"> </w:t>
+      </w:r>
+      <w:r>
+        <w:t xml:space="preserve">(BẮT BUỘC — bản 9.62 cũng đổi</w:t>
+      </w:r>
+      <w:r>
+        <w:t xml:space="preserve"> </w:t>
+      </w:r>
+      <w:r>
+        <w:rPr>
+          <w:rStyle w:val="VerbatimChar"/>
+        </w:rPr>
+        <w:t xml:space="preserve">RealtimeEndpointsPage.jsx</w:t>
+      </w:r>
+      <w:r>
+        <w:t xml:space="preserve">, cùng lý do như Phần 1 bước 3 — xem chú</w:t>
+      </w:r>
+      <w:r>
+        <w:t xml:space="preserve"> </w:t>
+      </w:r>
+      <w:r>
+        <w:t xml:space="preserve">thích ở đó), rồi khởi động lại</w:t>
       </w:r>
       <w:r>
         <w:t xml:space="preserve"> </w:t>

</xml_diff>